<commit_message>
semana 9-10-11 y fase3
</commit_message>
<xml_diff>
--- a/Ciclo-2026-Segundo-Semestre/Contenido/9_Semana_9/Lectura.docx
+++ b/Ciclo-2026-Segundo-Semestre/Contenido/9_Semana_9/Lectura.docx
@@ -16,7 +16,7 @@
         <w:shd w:fill="auto" w:val="clear"/>
         <w:rPr/>
       </w:pPr>
-      <w:bookmarkStart w:colFirst="0" w:colLast="0" w:name="_dm1us74zea3s" w:id="0"/>
+      <w:bookmarkStart w:colFirst="0" w:colLast="0" w:name="_heading=h.y9al7emh4s3x" w:id="0"/>
       <w:bookmarkEnd w:id="0"/>
       <w:r>
         <w:rPr>
@@ -44,9 +44,9 @@
           <mc:Choice Requires="wpg">
             <w:drawing>
               <wp:inline distB="114300" distT="114300" distL="114300" distR="114300">
-                <wp:extent cx="1726586" cy="85264"/>
+                <wp:extent cx="1736111" cy="94789"/>
                 <wp:effectExtent b="0" l="0" r="0" t="0"/>
-                <wp:docPr id="1" name=""/>
+                <wp:docPr id="12" name=""/>
                 <a:graphic>
                   <a:graphicData uri="http://schemas.microsoft.com/office/word/2010/wordprocessingShape">
                     <wps:wsp>
@@ -54,7 +54,7 @@
                       <wps:cNvPr id="2" name="Shape 2"/>
                       <wps:spPr>
                         <a:xfrm>
-                          <a:off x="2599775" y="1351200"/>
+                          <a:off x="4594800" y="3724200"/>
                           <a:ext cx="1502400" cy="111600"/>
                         </a:xfrm>
                         <a:prstGeom prst="rect">
@@ -97,9 +97,9 @@
           <mc:Fallback>
             <w:drawing>
               <wp:inline distB="114300" distT="114300" distL="114300" distR="114300">
-                <wp:extent cx="1726586" cy="85264"/>
+                <wp:extent cx="1736111" cy="94789"/>
                 <wp:effectExtent b="0" l="0" r="0" t="0"/>
-                <wp:docPr id="1" name="image8.png"/>
+                <wp:docPr id="12" name="image8.png"/>
                 <a:graphic>
                   <a:graphicData uri="http://schemas.openxmlformats.org/drawingml/2006/picture">
                     <pic:pic>
@@ -108,7 +108,7 @@
                         <pic:cNvPicPr preferRelativeResize="0"/>
                       </pic:nvPicPr>
                       <pic:blipFill>
-                        <a:blip r:embed="rId6"/>
+                        <a:blip r:embed="rId7"/>
                         <a:srcRect/>
                         <a:stretch>
                           <a:fillRect/>
@@ -117,7 +117,7 @@
                       <pic:spPr>
                         <a:xfrm>
                           <a:off x="0" y="0"/>
-                          <a:ext cx="1726586" cy="85264"/>
+                          <a:ext cx="1736111" cy="94789"/>
                         </a:xfrm>
                         <a:prstGeom prst="rect"/>
                         <a:ln/>
@@ -176,26 +176,6 @@
     </w:p>
     <w:p>
       <w:pPr>
-        <w:rPr/>
-      </w:pPr>
-      <w:r>
-        <w:rPr>
-          <w:rtl w:val="0"/>
-        </w:rPr>
-      </w:r>
-    </w:p>
-    <w:p>
-      <w:pPr>
-        <w:rPr/>
-      </w:pPr>
-      <w:r>
-        <w:rPr>
-          <w:rtl w:val="0"/>
-        </w:rPr>
-      </w:r>
-    </w:p>
-    <w:p>
-      <w:pPr>
         <w:spacing w:after="240" w:before="240" w:line="276" w:lineRule="auto"/>
         <w:jc w:val="center"/>
         <w:rPr>
@@ -239,7 +219,7 @@
           <wp:inline distB="114300" distT="114300" distL="114300" distR="114300">
             <wp:extent cx="222141" cy="222141"/>
             <wp:effectExtent b="0" l="0" r="0" t="0"/>
-            <wp:docPr id="11" name="image5.png"/>
+            <wp:docPr id="14" name="image5.png"/>
             <a:graphic>
               <a:graphicData uri="http://schemas.openxmlformats.org/drawingml/2006/picture">
                 <pic:pic>
@@ -248,7 +228,7 @@
                     <pic:cNvPicPr preferRelativeResize="0"/>
                   </pic:nvPicPr>
                   <pic:blipFill>
-                    <a:blip r:embed="rId7"/>
+                    <a:blip r:embed="rId8"/>
                     <a:srcRect b="0" l="0" r="0" t="0"/>
                     <a:stretch>
                       <a:fillRect/>
@@ -325,63 +305,6 @@
     </w:p>
     <w:p>
       <w:pPr>
-        <w:spacing w:after="240" w:before="240" w:line="276" w:lineRule="auto"/>
-        <w:jc w:val="left"/>
-        <w:rPr>
-          <w:rFonts w:ascii="Arial" w:cs="Arial" w:eastAsia="Arial" w:hAnsi="Arial"/>
-          <w:b w:val="1"/>
-          <w:bCs w:val="1"/>
-          <w:color w:val="1c4587"/>
-          <w:sz w:val="40"/>
-          <w:szCs w:val="40"/>
-        </w:rPr>
-      </w:pPr>
-      <w:r>
-        <w:rPr>
-          <w:rtl w:val="0"/>
-        </w:rPr>
-      </w:r>
-    </w:p>
-    <w:p>
-      <w:pPr>
-        <w:spacing w:after="240" w:before="240" w:line="276" w:lineRule="auto"/>
-        <w:jc w:val="left"/>
-        <w:rPr>
-          <w:rFonts w:ascii="Arial" w:cs="Arial" w:eastAsia="Arial" w:hAnsi="Arial"/>
-          <w:b w:val="1"/>
-          <w:bCs w:val="1"/>
-          <w:color w:val="1c4587"/>
-          <w:sz w:val="40"/>
-          <w:szCs w:val="40"/>
-        </w:rPr>
-      </w:pPr>
-      <w:r>
-        <w:rPr>
-          <w:rtl w:val="0"/>
-        </w:rPr>
-      </w:r>
-    </w:p>
-    <w:p>
-      <w:pPr>
-        <w:spacing w:after="240" w:before="240" w:line="276" w:lineRule="auto"/>
-        <w:jc w:val="left"/>
-        <w:rPr>
-          <w:rFonts w:ascii="Arial" w:cs="Arial" w:eastAsia="Arial" w:hAnsi="Arial"/>
-          <w:b w:val="1"/>
-          <w:bCs w:val="1"/>
-          <w:color w:val="1c4587"/>
-          <w:sz w:val="40"/>
-          <w:szCs w:val="40"/>
-        </w:rPr>
-      </w:pPr>
-      <w:r>
-        <w:rPr>
-          <w:rtl w:val="0"/>
-        </w:rPr>
-      </w:r>
-    </w:p>
-    <w:p>
-      <w:pPr>
         <w:rPr>
           <w:rFonts w:ascii="Arial" w:cs="Arial" w:eastAsia="Arial" w:hAnsi="Arial"/>
           <w:sz w:val="24"/>
@@ -520,19 +443,16 @@
           <w:ilvl w:val="0"/>
           <w:numId w:val="4"/>
         </w:numPr>
-      </w:pPr>
-      <w:bookmarkStart w:colFirst="0" w:colLast="0" w:name="_k1d1swi451i0" w:id="1"/>
+        <w:ind w:left="720" w:hanging="360"/>
+        <w:rPr/>
+      </w:pPr>
+      <w:bookmarkStart w:colFirst="0" w:colLast="0" w:name="_heading=h.hao371h3knmw" w:id="1"/>
       <w:bookmarkEnd w:id="1"/>
       <w:r>
         <w:rPr>
           <w:rtl w:val="0"/>
         </w:rPr>
         <w:t xml:space="preserve">Marco Formativo</w:t>
-      </w:r>
-      <w:r>
-        <w:rPr>
-          <w:rtl w:val="0"/>
-        </w:rPr>
       </w:r>
     </w:p>
     <w:p>
@@ -543,7 +463,7 @@
           <w:rFonts w:ascii="Arial" w:cs="Arial" w:eastAsia="Arial" w:hAnsi="Arial"/>
         </w:rPr>
       </w:pPr>
-      <w:bookmarkStart w:colFirst="0" w:colLast="0" w:name="_ph1lihtw76wz" w:id="2"/>
+      <w:bookmarkStart w:colFirst="0" w:colLast="0" w:name="_heading=h.jtcsgehfqmpc" w:id="2"/>
       <w:bookmarkEnd w:id="2"/>
       <w:r>
         <w:rPr>
@@ -686,11 +606,6 @@
               </w:rPr>
               <w:t xml:space="preserve">Pensamiento analítico</w:t>
             </w:r>
-            <w:r>
-              <w:rPr>
-                <w:rtl w:val="0"/>
-              </w:rPr>
-            </w:r>
           </w:p>
         </w:tc>
         <w:tc>
@@ -715,11 +630,6 @@
               </w:rPr>
               <w:t xml:space="preserve">Analizando conexiones, relaciones y recorridos dentro de estructuras complejas.</w:t>
             </w:r>
-            <w:r>
-              <w:rPr>
-                <w:rtl w:val="0"/>
-              </w:rPr>
-            </w:r>
           </w:p>
         </w:tc>
       </w:tr>
@@ -730,19 +640,13 @@
         <w:ind w:left="0" w:firstLine="0"/>
         <w:rPr/>
       </w:pPr>
-      <w:bookmarkStart w:colFirst="0" w:colLast="0" w:name="_rkumsa8kgnrx" w:id="3"/>
+      <w:bookmarkStart w:colFirst="0" w:colLast="0" w:name="_heading=h.9nh6merjnysm" w:id="3"/>
       <w:bookmarkEnd w:id="3"/>
       <w:r>
         <w:rPr>
           <w:rtl w:val="0"/>
         </w:rPr>
-        <w:t xml:space="preserve">1.2 </w:t>
-      </w:r>
-      <w:r>
-        <w:rPr>
-          <w:rtl w:val="0"/>
-        </w:rPr>
-        <w:t xml:space="preserve">Competencia(s)</w:t>
+        <w:t xml:space="preserve">1.2 Competencia(s)</w:t>
       </w:r>
     </w:p>
     <w:tbl>
@@ -978,6 +882,7 @@
           <w:ilvl w:val="0"/>
           <w:numId w:val="4"/>
         </w:numPr>
+        <w:ind w:left="720" w:hanging="360"/>
         <w:rPr>
           <w:rFonts w:ascii="Arial" w:cs="Arial" w:eastAsia="Arial" w:hAnsi="Arial"/>
           <w:b w:val="1"/>
@@ -987,7 +892,7 @@
           <w:szCs w:val="36"/>
         </w:rPr>
       </w:pPr>
-      <w:bookmarkStart w:colFirst="0" w:colLast="0" w:name="_t08ry3cv2q85" w:id="4"/>
+      <w:bookmarkStart w:colFirst="0" w:colLast="0" w:name="_heading=h.yzzi5mp72yqx" w:id="4"/>
       <w:bookmarkEnd w:id="4"/>
       <w:r>
         <w:rPr>
@@ -1121,6 +1026,7 @@
           <w:ilvl w:val="0"/>
           <w:numId w:val="4"/>
         </w:numPr>
+        <w:ind w:left="720" w:hanging="360"/>
         <w:rPr>
           <w:rFonts w:ascii="Arial" w:cs="Arial" w:eastAsia="Arial" w:hAnsi="Arial"/>
           <w:b w:val="1"/>
@@ -1130,7 +1036,7 @@
           <w:szCs w:val="36"/>
         </w:rPr>
       </w:pPr>
-      <w:bookmarkStart w:colFirst="0" w:colLast="0" w:name="_u5ufplprbhq" w:id="5"/>
+      <w:bookmarkStart w:colFirst="0" w:colLast="0" w:name="_heading=h.bkd7i0ogthd7" w:id="5"/>
       <w:bookmarkEnd w:id="5"/>
       <w:r>
         <w:rPr>
@@ -1307,11 +1213,10 @@
           <w:ilvl w:val="0"/>
           <w:numId w:val="4"/>
         </w:numPr>
-        <w:rPr>
-          <w:u w:val="none"/>
-        </w:rPr>
-      </w:pPr>
-      <w:bookmarkStart w:colFirst="0" w:colLast="0" w:name="_qglg4jrqkw0s" w:id="6"/>
+        <w:ind w:left="720" w:hanging="360"/>
+        <w:rPr/>
+      </w:pPr>
+      <w:bookmarkStart w:colFirst="0" w:colLast="0" w:name="_heading=h.f6lxfytaebx0" w:id="6"/>
       <w:bookmarkEnd w:id="6"/>
       <w:r>
         <w:rPr>
@@ -1319,6 +1224,11 @@
         </w:rPr>
         <w:t xml:space="preserve">Contenidos</w:t>
       </w:r>
+      <w:r>
+        <w:rPr>
+          <w:rtl w:val="0"/>
+        </w:rPr>
+      </w:r>
     </w:p>
     <w:p>
       <w:pPr>
@@ -1330,18 +1240,13 @@
         </w:rPr>
         <w:t xml:space="preserve">Presentación de temas y subtemas.</w:t>
       </w:r>
-      <w:r>
-        <w:rPr>
-          <w:rtl w:val="0"/>
-        </w:rPr>
-      </w:r>
     </w:p>
     <w:p>
       <w:pPr>
         <w:pStyle w:val="Heading2"/>
         <w:rPr/>
       </w:pPr>
-      <w:bookmarkStart w:colFirst="0" w:colLast="0" w:name="_17r52fxma8tc" w:id="7"/>
+      <w:bookmarkStart w:colFirst="0" w:colLast="0" w:name="_heading=h.4uwrz1jqrq0i" w:id="7"/>
       <w:bookmarkEnd w:id="7"/>
       <w:r>
         <w:rPr>
@@ -1384,16 +1289,16 @@
           <wp:inline distB="114300" distT="114300" distL="114300" distR="114300">
             <wp:extent cx="4476750" cy="2809875"/>
             <wp:effectExtent b="0" l="0" r="0" t="0"/>
-            <wp:docPr id="8" name="image4.png"/>
+            <wp:docPr id="17" name="image6.png"/>
             <a:graphic>
               <a:graphicData uri="http://schemas.openxmlformats.org/drawingml/2006/picture">
                 <pic:pic>
                   <pic:nvPicPr>
-                    <pic:cNvPr id="0" name="image4.png"/>
+                    <pic:cNvPr id="0" name="image6.png"/>
                     <pic:cNvPicPr preferRelativeResize="0"/>
                   </pic:nvPicPr>
                   <pic:blipFill>
-                    <a:blip r:embed="rId8"/>
+                    <a:blip r:embed="rId9"/>
                     <a:srcRect b="0" l="0" r="0" t="0"/>
                     <a:stretch>
                       <a:fillRect/>
@@ -1425,7 +1330,7 @@
         <w:jc w:val="center"/>
         <w:rPr/>
       </w:pPr>
-      <w:bookmarkStart w:colFirst="0" w:colLast="0" w:name="_nm8nwde5f4f" w:id="8"/>
+      <w:bookmarkStart w:colFirst="0" w:colLast="0" w:name="_heading=h.gww14jb4h5b8" w:id="8"/>
       <w:bookmarkEnd w:id="8"/>
       <w:r>
         <w:rPr>
@@ -1457,18 +1362,13 @@
         </w:rPr>
         <w:t xml:space="preserve">La principal ventaja de los grafos es su capacidad para representar sistemas complejos donde todo se encuentra conectado de alguna manera. Mientras una lista o un arreglo almacenan información de forma secuencial, un grafo permite múltiples relaciones simultáneas entre elementos.</w:t>
       </w:r>
-      <w:r>
-        <w:rPr>
-          <w:rtl w:val="0"/>
-        </w:rPr>
-      </w:r>
     </w:p>
     <w:p>
       <w:pPr>
         <w:pStyle w:val="Heading2"/>
         <w:rPr/>
       </w:pPr>
-      <w:bookmarkStart w:colFirst="0" w:colLast="0" w:name="_m751begra7f3" w:id="9"/>
+      <w:bookmarkStart w:colFirst="0" w:colLast="0" w:name="_heading=h.ez7fwm7lfr4a" w:id="9"/>
       <w:bookmarkEnd w:id="9"/>
       <w:r>
         <w:rPr>
@@ -1495,7 +1395,7 @@
         <w:keepNext w:val="0"/>
         <w:keepLines w:val="0"/>
         <w:pBdr>
-          <w:bottom w:color="auto" w:space="0" w:sz="0" w:val="none"/>
+          <w:bottom w:color="000000" w:space="0" w:sz="0" w:val="none"/>
         </w:pBdr>
         <w:spacing w:before="360" w:line="300" w:lineRule="auto"/>
         <w:rPr>
@@ -1504,7 +1404,7 @@
           <w:szCs w:val="34"/>
         </w:rPr>
       </w:pPr>
-      <w:bookmarkStart w:colFirst="0" w:colLast="0" w:name="_b764yhmxcmej" w:id="10"/>
+      <w:bookmarkStart w:colFirst="0" w:colLast="0" w:name="_heading=h.d6dtbegiuv37" w:id="10"/>
       <w:bookmarkEnd w:id="10"/>
       <w:r>
         <w:rPr>
@@ -1563,7 +1463,7 @@
         <w:keepNext w:val="0"/>
         <w:keepLines w:val="0"/>
         <w:pBdr>
-          <w:bottom w:color="auto" w:space="0" w:sz="0" w:val="none"/>
+          <w:bottom w:color="000000" w:space="0" w:sz="0" w:val="none"/>
         </w:pBdr>
         <w:spacing w:before="360" w:line="300" w:lineRule="auto"/>
         <w:rPr>
@@ -1572,7 +1472,7 @@
           <w:szCs w:val="34"/>
         </w:rPr>
       </w:pPr>
-      <w:bookmarkStart w:colFirst="0" w:colLast="0" w:name="_xg8mdgaiww85" w:id="11"/>
+      <w:bookmarkStart w:colFirst="0" w:colLast="0" w:name="_heading=h.5tsh8qs14ycg" w:id="11"/>
       <w:bookmarkEnd w:id="11"/>
       <w:r>
         <w:rPr>
@@ -1631,7 +1531,7 @@
         <w:keepNext w:val="0"/>
         <w:keepLines w:val="0"/>
         <w:pBdr>
-          <w:bottom w:color="auto" w:space="0" w:sz="0" w:val="none"/>
+          <w:bottom w:color="000000" w:space="0" w:sz="0" w:val="none"/>
         </w:pBdr>
         <w:spacing w:before="360" w:line="300" w:lineRule="auto"/>
         <w:rPr>
@@ -1640,7 +1540,7 @@
           <w:szCs w:val="34"/>
         </w:rPr>
       </w:pPr>
-      <w:bookmarkStart w:colFirst="0" w:colLast="0" w:name="_1k2a5t2h0oyy" w:id="12"/>
+      <w:bookmarkStart w:colFirst="0" w:colLast="0" w:name="_heading=h.q5oxc7j7guih" w:id="12"/>
       <w:bookmarkEnd w:id="12"/>
       <w:r>
         <w:rPr>
@@ -1698,7 +1598,7 @@
         <w:pStyle w:val="Heading2"/>
         <w:rPr/>
       </w:pPr>
-      <w:bookmarkStart w:colFirst="0" w:colLast="0" w:name="_fu0bkhp1pxnr" w:id="13"/>
+      <w:bookmarkStart w:colFirst="0" w:colLast="0" w:name="_heading=h.cu3vq4xazoww" w:id="13"/>
       <w:bookmarkEnd w:id="13"/>
       <w:r>
         <w:rPr>
@@ -1780,7 +1680,7 @@
         <w:pStyle w:val="Heading2"/>
         <w:rPr/>
       </w:pPr>
-      <w:bookmarkStart w:colFirst="0" w:colLast="0" w:name="_cyozq2iwueue" w:id="14"/>
+      <w:bookmarkStart w:colFirst="0" w:colLast="0" w:name="_heading=h.het973abqqpr" w:id="14"/>
       <w:bookmarkEnd w:id="14"/>
       <w:r>
         <w:rPr>
@@ -1831,8 +1731,9 @@
           <w:ilvl w:val="0"/>
           <w:numId w:val="2"/>
         </w:numPr>
-        <w:spacing w:after="0" w:afterAutospacing="0" w:before="240" w:lineRule="auto"/>
+        <w:spacing w:after="0" w:before="240" w:lineRule="auto"/>
         <w:ind w:left="720" w:hanging="360"/>
+        <w:rPr/>
       </w:pPr>
       <w:r>
         <w:rPr>
@@ -1847,8 +1748,9 @@
           <w:ilvl w:val="0"/>
           <w:numId w:val="2"/>
         </w:numPr>
-        <w:spacing w:after="0" w:afterAutospacing="0" w:before="0" w:beforeAutospacing="0" w:lineRule="auto"/>
+        <w:spacing w:after="0" w:before="0" w:lineRule="auto"/>
         <w:ind w:left="720" w:hanging="360"/>
+        <w:rPr/>
       </w:pPr>
       <w:r>
         <w:rPr>
@@ -1863,8 +1765,9 @@
           <w:ilvl w:val="0"/>
           <w:numId w:val="2"/>
         </w:numPr>
-        <w:spacing w:after="0" w:afterAutospacing="0" w:before="0" w:beforeAutospacing="0" w:lineRule="auto"/>
+        <w:spacing w:after="0" w:before="0" w:lineRule="auto"/>
         <w:ind w:left="720" w:hanging="360"/>
+        <w:rPr/>
       </w:pPr>
       <w:r>
         <w:rPr>
@@ -1879,8 +1782,9 @@
           <w:ilvl w:val="0"/>
           <w:numId w:val="2"/>
         </w:numPr>
-        <w:spacing w:after="240" w:before="0" w:beforeAutospacing="0" w:lineRule="auto"/>
+        <w:spacing w:after="240" w:before="0" w:lineRule="auto"/>
         <w:ind w:left="720" w:hanging="360"/>
+        <w:rPr/>
       </w:pPr>
       <w:r>
         <w:rPr>
@@ -1925,7 +1829,7 @@
           <wp:inline distB="114300" distT="114300" distL="114300" distR="114300">
             <wp:extent cx="2871788" cy="4594860"/>
             <wp:effectExtent b="0" l="0" r="0" t="0"/>
-            <wp:docPr id="4" name="image7.png"/>
+            <wp:docPr id="15" name="image7.png"/>
             <a:graphic>
               <a:graphicData uri="http://schemas.openxmlformats.org/drawingml/2006/picture">
                 <pic:pic>
@@ -1934,7 +1838,7 @@
                     <pic:cNvPicPr preferRelativeResize="0"/>
                   </pic:nvPicPr>
                   <pic:blipFill>
-                    <a:blip r:embed="rId9"/>
+                    <a:blip r:embed="rId10"/>
                     <a:srcRect b="0" l="0" r="0" t="0"/>
                     <a:stretch>
                       <a:fillRect/>
@@ -1966,7 +1870,7 @@
         <w:jc w:val="center"/>
         <w:rPr/>
       </w:pPr>
-      <w:bookmarkStart w:colFirst="0" w:colLast="0" w:name="_t4nz7r4fqxqh" w:id="15"/>
+      <w:bookmarkStart w:colFirst="0" w:colLast="0" w:name="_heading=h.xqx6v4xkfs9y" w:id="15"/>
       <w:bookmarkEnd w:id="15"/>
       <w:r>
         <w:rPr>
@@ -1992,7 +1896,7 @@
         <w:pStyle w:val="Heading2"/>
         <w:rPr/>
       </w:pPr>
-      <w:bookmarkStart w:colFirst="0" w:colLast="0" w:name="_2xe5j4urq2rg" w:id="16"/>
+      <w:bookmarkStart w:colFirst="0" w:colLast="0" w:name="_heading=h.bwxsep8togzr" w:id="16"/>
       <w:bookmarkEnd w:id="16"/>
       <w:r>
         <w:rPr>
@@ -2439,7 +2343,7 @@
         <w:jc w:val="center"/>
         <w:rPr/>
       </w:pPr>
-      <w:bookmarkStart w:colFirst="0" w:colLast="0" w:name="_l74v4ukqr2hy" w:id="17"/>
+      <w:bookmarkStart w:colFirst="0" w:colLast="0" w:name="_heading=h.3c2zxcsejrk3" w:id="17"/>
       <w:bookmarkEnd w:id="17"/>
       <w:r>
         <w:rPr>
@@ -2453,7 +2357,7 @@
         <w:jc w:val="center"/>
         <w:rPr/>
       </w:pPr>
-      <w:bookmarkStart w:colFirst="0" w:colLast="0" w:name="_clnxk6bg8p0a" w:id="18"/>
+      <w:bookmarkStart w:colFirst="0" w:colLast="0" w:name="_heading=h.4wfkooah5juj" w:id="18"/>
       <w:bookmarkEnd w:id="18"/>
       <w:r>
         <w:rPr>
@@ -2467,7 +2371,7 @@
         <w:jc w:val="center"/>
         <w:rPr/>
       </w:pPr>
-      <w:bookmarkStart w:colFirst="0" w:colLast="0" w:name="_so8y9yny6hxl" w:id="19"/>
+      <w:bookmarkStart w:colFirst="0" w:colLast="0" w:name="_heading=h.mjohfng5xglo" w:id="19"/>
       <w:bookmarkEnd w:id="19"/>
       <w:r>
         <w:rPr>
@@ -2481,7 +2385,7 @@
         <w:jc w:val="center"/>
         <w:rPr/>
       </w:pPr>
-      <w:bookmarkStart w:colFirst="0" w:colLast="0" w:name="_m12njw9648qj" w:id="20"/>
+      <w:bookmarkStart w:colFirst="0" w:colLast="0" w:name="_heading=h.wcw4xhccpfjc" w:id="20"/>
       <w:bookmarkEnd w:id="20"/>
       <w:r>
         <w:rPr>
@@ -2495,7 +2399,7 @@
         <w:jc w:val="center"/>
         <w:rPr/>
       </w:pPr>
-      <w:bookmarkStart w:colFirst="0" w:colLast="0" w:name="_ki3v2nrn1q1q" w:id="21"/>
+      <w:bookmarkStart w:colFirst="0" w:colLast="0" w:name="_heading=h.2q44qbt4n4v0" w:id="21"/>
       <w:bookmarkEnd w:id="21"/>
       <w:r>
         <w:rPr>
@@ -2509,7 +2413,7 @@
         <w:jc w:val="center"/>
         <w:rPr/>
       </w:pPr>
-      <w:bookmarkStart w:colFirst="0" w:colLast="0" w:name="_470b2ibakaj6" w:id="22"/>
+      <w:bookmarkStart w:colFirst="0" w:colLast="0" w:name="_heading=h.mtv7fhxleahm" w:id="22"/>
       <w:bookmarkEnd w:id="22"/>
       <w:r>
         <w:rPr>
@@ -2523,7 +2427,7 @@
         <w:jc w:val="center"/>
         <w:rPr/>
       </w:pPr>
-      <w:bookmarkStart w:colFirst="0" w:colLast="0" w:name="_8p55iparv5hf" w:id="23"/>
+      <w:bookmarkStart w:colFirst="0" w:colLast="0" w:name="_heading=h.lp5uhdelqf13" w:id="23"/>
       <w:bookmarkEnd w:id="23"/>
       <w:r>
         <w:rPr>
@@ -2537,7 +2441,7 @@
         <w:jc w:val="center"/>
         <w:rPr/>
       </w:pPr>
-      <w:bookmarkStart w:colFirst="0" w:colLast="0" w:name="_vvj2dymwv146" w:id="24"/>
+      <w:bookmarkStart w:colFirst="0" w:colLast="0" w:name="_heading=h.f6es8v9t5ma4" w:id="24"/>
       <w:bookmarkEnd w:id="24"/>
       <w:r>
         <w:rPr>
@@ -2551,7 +2455,7 @@
         <w:jc w:val="center"/>
         <w:rPr/>
       </w:pPr>
-      <w:bookmarkStart w:colFirst="0" w:colLast="0" w:name="_u403btnqlvwv" w:id="25"/>
+      <w:bookmarkStart w:colFirst="0" w:colLast="0" w:name="_heading=h.5vc2mdzhgix" w:id="25"/>
       <w:bookmarkEnd w:id="25"/>
       <w:r>
         <w:rPr>
@@ -2565,7 +2469,7 @@
         <w:jc w:val="center"/>
         <w:rPr/>
       </w:pPr>
-      <w:bookmarkStart w:colFirst="0" w:colLast="0" w:name="_615yjdrhxfa" w:id="26"/>
+      <w:bookmarkStart w:colFirst="0" w:colLast="0" w:name="_heading=h.aijemmidmun4" w:id="26"/>
       <w:bookmarkEnd w:id="26"/>
       <w:r>
         <w:rPr>
@@ -2579,7 +2483,7 @@
         <w:jc w:val="center"/>
         <w:rPr/>
       </w:pPr>
-      <w:bookmarkStart w:colFirst="0" w:colLast="0" w:name="_ialp7x72ihu4" w:id="27"/>
+      <w:bookmarkStart w:colFirst="0" w:colLast="0" w:name="_heading=h.yuw9463mz28d" w:id="27"/>
       <w:bookmarkEnd w:id="27"/>
       <w:r>
         <w:rPr>
@@ -2593,7 +2497,7 @@
         <w:jc w:val="center"/>
         <w:rPr/>
       </w:pPr>
-      <w:bookmarkStart w:colFirst="0" w:colLast="0" w:name="_ljomlln83wu6" w:id="28"/>
+      <w:bookmarkStart w:colFirst="0" w:colLast="0" w:name="_heading=h.albjtgumsw6m" w:id="28"/>
       <w:bookmarkEnd w:id="28"/>
       <w:r>
         <w:rPr>
@@ -2607,7 +2511,7 @@
         <w:jc w:val="center"/>
         <w:rPr/>
       </w:pPr>
-      <w:bookmarkStart w:colFirst="0" w:colLast="0" w:name="_kp9gix1zx4zg" w:id="29"/>
+      <w:bookmarkStart w:colFirst="0" w:colLast="0" w:name="_heading=h.nrfs4irh8pjw" w:id="29"/>
       <w:bookmarkEnd w:id="29"/>
       <w:r>
         <w:rPr>
@@ -2621,7 +2525,7 @@
         <w:jc w:val="center"/>
         <w:rPr/>
       </w:pPr>
-      <w:bookmarkStart w:colFirst="0" w:colLast="0" w:name="_3v1u3nqb3aj4" w:id="30"/>
+      <w:bookmarkStart w:colFirst="0" w:colLast="0" w:name="_heading=h.crk4d4xeap8e" w:id="30"/>
       <w:bookmarkEnd w:id="30"/>
       <w:r>
         <w:rPr>
@@ -2646,7 +2550,7 @@
         <w:pStyle w:val="Heading2"/>
         <w:rPr/>
       </w:pPr>
-      <w:bookmarkStart w:colFirst="0" w:colLast="0" w:name="_g3eqr0oa51z1" w:id="31"/>
+      <w:bookmarkStart w:colFirst="0" w:colLast="0" w:name="_heading=h.wsqb1f89yb9a" w:id="31"/>
       <w:bookmarkEnd w:id="31"/>
       <w:r>
         <w:rPr>
@@ -2661,7 +2565,7 @@
         <w:keepNext w:val="0"/>
         <w:keepLines w:val="0"/>
         <w:pBdr>
-          <w:bottom w:color="auto" w:space="0" w:sz="0" w:val="none"/>
+          <w:bottom w:color="000000" w:space="0" w:sz="0" w:val="none"/>
         </w:pBdr>
         <w:spacing w:before="360" w:line="300" w:lineRule="auto"/>
         <w:rPr>
@@ -2670,7 +2574,7 @@
           <w:szCs w:val="34"/>
         </w:rPr>
       </w:pPr>
-      <w:bookmarkStart w:colFirst="0" w:colLast="0" w:name="_gvuqhy899vgw" w:id="32"/>
+      <w:bookmarkStart w:colFirst="0" w:colLast="0" w:name="_heading=h.10zj2vrpcatw" w:id="32"/>
       <w:bookmarkEnd w:id="32"/>
       <w:r>
         <w:rPr>
@@ -2724,8 +2628,9 @@
           <w:ilvl w:val="0"/>
           <w:numId w:val="1"/>
         </w:numPr>
-        <w:spacing w:after="0" w:afterAutospacing="0" w:before="240" w:lineRule="auto"/>
+        <w:spacing w:after="0" w:before="240" w:lineRule="auto"/>
         <w:ind w:left="720" w:hanging="360"/>
+        <w:rPr/>
       </w:pPr>
       <w:r>
         <w:rPr>
@@ -2740,8 +2645,9 @@
           <w:ilvl w:val="0"/>
           <w:numId w:val="1"/>
         </w:numPr>
-        <w:spacing w:after="0" w:afterAutospacing="0" w:before="0" w:beforeAutospacing="0" w:lineRule="auto"/>
+        <w:spacing w:after="0" w:before="0" w:lineRule="auto"/>
         <w:ind w:left="720" w:hanging="360"/>
+        <w:rPr/>
       </w:pPr>
       <w:r>
         <w:rPr>
@@ -2756,8 +2662,9 @@
           <w:ilvl w:val="0"/>
           <w:numId w:val="1"/>
         </w:numPr>
-        <w:spacing w:after="0" w:afterAutospacing="0" w:before="0" w:beforeAutospacing="0" w:lineRule="auto"/>
+        <w:spacing w:after="0" w:before="0" w:lineRule="auto"/>
         <w:ind w:left="720" w:hanging="360"/>
+        <w:rPr/>
       </w:pPr>
       <w:r>
         <w:rPr>
@@ -2772,8 +2679,9 @@
           <w:ilvl w:val="0"/>
           <w:numId w:val="1"/>
         </w:numPr>
-        <w:spacing w:after="240" w:before="0" w:beforeAutospacing="0" w:lineRule="auto"/>
+        <w:spacing w:after="240" w:before="0" w:lineRule="auto"/>
         <w:ind w:left="720" w:hanging="360"/>
+        <w:rPr/>
       </w:pPr>
       <w:r>
         <w:rPr>
@@ -2813,6 +2721,7 @@
           <w:ilvl w:val="0"/>
           <w:numId w:val="4"/>
         </w:numPr>
+        <w:ind w:left="720" w:hanging="360"/>
         <w:rPr>
           <w:b w:val="1"/>
           <w:bCs w:val="1"/>
@@ -2821,13 +2730,18 @@
           <w:szCs w:val="36"/>
         </w:rPr>
       </w:pPr>
-      <w:bookmarkStart w:colFirst="0" w:colLast="0" w:name="_sem9pop2a96t" w:id="33"/>
+      <w:bookmarkStart w:colFirst="0" w:colLast="0" w:name="_heading=h.62joyk8c4kpe" w:id="33"/>
       <w:bookmarkEnd w:id="33"/>
       <w:r>
         <w:rPr>
           <w:rtl w:val="0"/>
         </w:rPr>
         <w:t xml:space="preserve">Conclusiones</w:t>
+      </w:r>
+      <w:r>
+        <w:rPr>
+          <w:rtl w:val="0"/>
+        </w:rPr>
       </w:r>
     </w:p>
     <w:p>
@@ -2903,6 +2817,7 @@
           <w:ilvl w:val="0"/>
           <w:numId w:val="4"/>
         </w:numPr>
+        <w:ind w:left="720" w:hanging="360"/>
         <w:rPr>
           <w:rFonts w:ascii="Arial" w:cs="Arial" w:eastAsia="Arial" w:hAnsi="Arial"/>
           <w:b w:val="1"/>
@@ -2912,13 +2827,18 @@
           <w:szCs w:val="36"/>
         </w:rPr>
       </w:pPr>
-      <w:bookmarkStart w:colFirst="0" w:colLast="0" w:name="_dr1r2ssj5lrg" w:id="34"/>
+      <w:bookmarkStart w:colFirst="0" w:colLast="0" w:name="_heading=h.fo6bz9uggv2l" w:id="34"/>
       <w:bookmarkEnd w:id="34"/>
       <w:r>
         <w:rPr>
           <w:rtl w:val="0"/>
         </w:rPr>
         <w:t xml:space="preserve">Referencias</w:t>
+      </w:r>
+      <w:r>
+        <w:rPr>
+          <w:rtl w:val="0"/>
+        </w:rPr>
       </w:r>
     </w:p>
     <w:p>
@@ -2938,9 +2858,10 @@
           <w:ilvl w:val="0"/>
           <w:numId w:val="3"/>
         </w:numPr>
-        <w:spacing w:after="0" w:afterAutospacing="0"/>
+        <w:spacing w:after="0" w:lineRule="auto"/>
         <w:ind w:left="720" w:hanging="360"/>
         <w:jc w:val="both"/>
+        <w:rPr/>
       </w:pPr>
       <w:r>
         <w:rPr>
@@ -2969,9 +2890,10 @@
           <w:ilvl w:val="0"/>
           <w:numId w:val="3"/>
         </w:numPr>
-        <w:spacing w:after="0" w:afterAutospacing="0" w:before="0" w:beforeAutospacing="0"/>
+        <w:spacing w:after="0" w:before="0" w:lineRule="auto"/>
         <w:ind w:left="720" w:hanging="360"/>
         <w:jc w:val="both"/>
+        <w:rPr/>
       </w:pPr>
       <w:r>
         <w:rPr>
@@ -3000,9 +2922,10 @@
           <w:ilvl w:val="0"/>
           <w:numId w:val="3"/>
         </w:numPr>
-        <w:spacing w:after="0" w:afterAutospacing="0" w:before="0" w:beforeAutospacing="0"/>
+        <w:spacing w:after="0" w:before="0" w:lineRule="auto"/>
         <w:ind w:left="720" w:hanging="360"/>
         <w:jc w:val="both"/>
+        <w:rPr/>
       </w:pPr>
       <w:r>
         <w:rPr>
@@ -3031,9 +2954,10 @@
           <w:ilvl w:val="0"/>
           <w:numId w:val="3"/>
         </w:numPr>
-        <w:spacing w:after="0" w:afterAutospacing="0" w:before="0" w:beforeAutospacing="0"/>
+        <w:spacing w:after="0" w:before="0" w:lineRule="auto"/>
         <w:ind w:left="720" w:hanging="360"/>
         <w:jc w:val="both"/>
+        <w:rPr/>
       </w:pPr>
       <w:r>
         <w:rPr>
@@ -3062,9 +2986,10 @@
           <w:ilvl w:val="0"/>
           <w:numId w:val="3"/>
         </w:numPr>
-        <w:spacing w:before="0" w:beforeAutospacing="0"/>
+        <w:spacing w:before="0" w:lineRule="auto"/>
         <w:ind w:left="720" w:hanging="360"/>
         <w:jc w:val="both"/>
+        <w:rPr/>
       </w:pPr>
       <w:r>
         <w:rPr>
@@ -3072,17 +2997,12 @@
         </w:rPr>
         <w:t xml:space="preserve">Documentación técnica de Google Maps y conceptos de PageRank.</w:t>
       </w:r>
-      <w:r>
-        <w:rPr>
-          <w:rtl w:val="0"/>
-        </w:rPr>
-      </w:r>
     </w:p>
     <w:sectPr>
-      <w:headerReference r:id="rId10" w:type="default"/>
-      <w:headerReference r:id="rId11" w:type="first"/>
-      <w:footerReference r:id="rId12" w:type="default"/>
-      <w:footerReference r:id="rId13" w:type="first"/>
+      <w:headerReference r:id="rId11" w:type="default"/>
+      <w:headerReference r:id="rId12" w:type="first"/>
+      <w:footerReference r:id="rId13" w:type="default"/>
+      <w:footerReference r:id="rId14" w:type="first"/>
       <w:pgSz w:h="15840" w:w="12240" w:orient="portrait"/>
       <w:pgMar w:bottom="1440" w:top="1440" w:left="1440" w:right="1440" w:header="0" w:footer="720"/>
       <w:pgNumType w:start="0"/>
@@ -3096,7 +3016,6 @@
 <w:ftr xmlns:mc="http://schemas.openxmlformats.org/markup-compatibility/2006" xmlns:o="urn:schemas-microsoft-com:office:office" xmlns:r="http://schemas.openxmlformats.org/officeDocument/2006/relationships" xmlns:m="http://schemas.openxmlformats.org/officeDocument/2006/math" xmlns:v="urn:schemas-microsoft-com:vml" xmlns:wp="http://schemas.openxmlformats.org/drawingml/2006/wordprocessingDrawing" xmlns:w10="urn:schemas-microsoft-com:office:word" xmlns:w="http://schemas.openxmlformats.org/wordprocessingml/2006/main" xmlns:wne="http://schemas.microsoft.com/office/word/2006/wordml" xmlns:sl="http://schemas.openxmlformats.org/schemaLibrary/2006/main" xmlns:a="http://schemas.openxmlformats.org/drawingml/2006/main" xmlns:pic="http://schemas.openxmlformats.org/drawingml/2006/picture" xmlns:c="http://schemas.openxmlformats.org/drawingml/2006/chart" xmlns:lc="http://schemas.openxmlformats.org/drawingml/2006/lockedCanvas" xmlns:dgm="http://schemas.openxmlformats.org/drawingml/2006/diagram" xmlns:wps="http://schemas.microsoft.com/office/word/2010/wordprocessingShape" xmlns:wpg="http://schemas.microsoft.com/office/word/2010/wordprocessingGroup" xmlns:w14="http://schemas.microsoft.com/office/word/2010/wordml" xmlns:w15="http://schemas.microsoft.com/office/word/2012/wordml" xmlns:w16="http://schemas.microsoft.com/office/word/2018/wordml" xmlns:w16cex="http://schemas.microsoft.com/office/word/2018/wordml/cex" xmlns:w16cid="http://schemas.microsoft.com/office/word/2016/wordml/cid" xmlns="http://schemas.microsoft.com/office/tasks/2019/documenttasks" xmlns:cr="http://schemas.microsoft.com/office/comments/2020/reactions">
   <w:p>
     <w:pPr>
-      <w:pageBreakBefore w:val="0"/>
       <w:pBdr>
         <w:top w:space="0" w:sz="0" w:val="nil"/>
         <w:left w:space="0" w:sz="0" w:val="nil"/>
@@ -3106,8 +3025,19 @@
       </w:pBdr>
       <w:shd w:fill="auto" w:val="clear"/>
       <w:jc w:val="right"/>
-      <w:rPr/>
+      <w:rPr>
+        <w:rFonts w:ascii="Arial" w:cs="Arial" w:eastAsia="Arial" w:hAnsi="Arial"/>
+      </w:rPr>
     </w:pPr>
+    <w:r>
+      <w:rPr>
+        <w:rFonts w:ascii="Arial" w:cs="Arial" w:eastAsia="Arial" w:hAnsi="Arial"/>
+      </w:rPr>
+      <w:fldChar w:fldCharType="begin"/>
+      <w:instrText xml:space="preserve">PAGE</w:instrText>
+      <w:fldChar w:fldCharType="separate"/>
+      <w:fldChar w:fldCharType="end"/>
+    </w:r>
     <w:r>
       <w:rPr>
         <w:rtl w:val="0"/>
@@ -3118,7 +3048,7 @@
         <wp:anchor allowOverlap="1" behindDoc="0" distB="0" distT="0" distL="0" distR="0" hidden="0" layoutInCell="1" locked="0" relativeHeight="0" simplePos="0">
           <wp:simplePos x="0" y="0"/>
           <wp:positionH relativeFrom="column">
-            <wp:posOffset>-914399</wp:posOffset>
+            <wp:posOffset>-914398</wp:posOffset>
           </wp:positionH>
           <wp:positionV relativeFrom="paragraph">
             <wp:posOffset>438150</wp:posOffset>
@@ -3126,12 +3056,12 @@
           <wp:extent cx="7781925" cy="409575"/>
           <wp:effectExtent b="0" l="0" r="0" t="0"/>
           <wp:wrapTopAndBottom distB="0" distT="0"/>
-          <wp:docPr descr="pie de página" id="3" name="image2.png"/>
+          <wp:docPr descr="pie de página" id="16" name="image1.png"/>
           <a:graphic>
             <a:graphicData uri="http://schemas.openxmlformats.org/drawingml/2006/picture">
               <pic:pic>
                 <pic:nvPicPr>
-                  <pic:cNvPr descr="pie de página" id="0" name="image2.png"/>
+                  <pic:cNvPr descr="pie de página" id="0" name="image1.png"/>
                   <pic:cNvPicPr preferRelativeResize="0"/>
                 </pic:nvPicPr>
                 <pic:blipFill>
@@ -3163,7 +3093,6 @@
 <w:ftr xmlns:mc="http://schemas.openxmlformats.org/markup-compatibility/2006" xmlns:o="urn:schemas-microsoft-com:office:office" xmlns:r="http://schemas.openxmlformats.org/officeDocument/2006/relationships" xmlns:m="http://schemas.openxmlformats.org/officeDocument/2006/math" xmlns:v="urn:schemas-microsoft-com:vml" xmlns:wp="http://schemas.openxmlformats.org/drawingml/2006/wordprocessingDrawing" xmlns:w10="urn:schemas-microsoft-com:office:word" xmlns:w="http://schemas.openxmlformats.org/wordprocessingml/2006/main" xmlns:wne="http://schemas.microsoft.com/office/word/2006/wordml" xmlns:sl="http://schemas.openxmlformats.org/schemaLibrary/2006/main" xmlns:a="http://schemas.openxmlformats.org/drawingml/2006/main" xmlns:pic="http://schemas.openxmlformats.org/drawingml/2006/picture" xmlns:c="http://schemas.openxmlformats.org/drawingml/2006/chart" xmlns:lc="http://schemas.openxmlformats.org/drawingml/2006/lockedCanvas" xmlns:dgm="http://schemas.openxmlformats.org/drawingml/2006/diagram" xmlns:wps="http://schemas.microsoft.com/office/word/2010/wordprocessingShape" xmlns:wpg="http://schemas.microsoft.com/office/word/2010/wordprocessingGroup" xmlns:w14="http://schemas.microsoft.com/office/word/2010/wordml" xmlns:w15="http://schemas.microsoft.com/office/word/2012/wordml" xmlns:w16="http://schemas.microsoft.com/office/word/2018/wordml" xmlns:w16cex="http://schemas.microsoft.com/office/word/2018/wordml/cex" xmlns:w16cid="http://schemas.microsoft.com/office/word/2016/wordml/cid" xmlns="http://schemas.microsoft.com/office/tasks/2019/documenttasks" xmlns:cr="http://schemas.microsoft.com/office/comments/2020/reactions">
   <w:p>
     <w:pPr>
-      <w:pageBreakBefore w:val="0"/>
       <w:pBdr>
         <w:top w:space="0" w:sz="0" w:val="nil"/>
         <w:left w:space="0" w:sz="0" w:val="nil"/>
@@ -3173,19 +3102,8 @@
       </w:pBdr>
       <w:shd w:fill="auto" w:val="clear"/>
       <w:jc w:val="right"/>
-      <w:rPr>
-        <w:rFonts w:ascii="Arial" w:cs="Arial" w:eastAsia="Arial" w:hAnsi="Arial"/>
-      </w:rPr>
+      <w:rPr/>
     </w:pPr>
-    <w:r>
-      <w:rPr>
-        <w:rFonts w:ascii="Arial" w:cs="Arial" w:eastAsia="Arial" w:hAnsi="Arial"/>
-      </w:rPr>
-      <w:fldChar w:fldCharType="begin"/>
-      <w:instrText xml:space="preserve">PAGE</w:instrText>
-      <w:fldChar w:fldCharType="separate"/>
-      <w:fldChar w:fldCharType="end"/>
-    </w:r>
     <w:r>
       <w:rPr>
         <w:rtl w:val="0"/>
@@ -3196,7 +3114,7 @@
         <wp:anchor allowOverlap="1" behindDoc="0" distB="0" distT="0" distL="0" distR="0" hidden="0" layoutInCell="1" locked="0" relativeHeight="0" simplePos="0">
           <wp:simplePos x="0" y="0"/>
           <wp:positionH relativeFrom="column">
-            <wp:posOffset>-914399</wp:posOffset>
+            <wp:posOffset>-914398</wp:posOffset>
           </wp:positionH>
           <wp:positionV relativeFrom="paragraph">
             <wp:posOffset>438150</wp:posOffset>
@@ -3204,12 +3122,12 @@
           <wp:extent cx="7781925" cy="409575"/>
           <wp:effectExtent b="0" l="0" r="0" t="0"/>
           <wp:wrapTopAndBottom distB="0" distT="0"/>
-          <wp:docPr descr="pie de página" id="5" name="image2.png"/>
+          <wp:docPr descr="pie de página" id="19" name="image1.png"/>
           <a:graphic>
             <a:graphicData uri="http://schemas.openxmlformats.org/drawingml/2006/picture">
               <pic:pic>
                 <pic:nvPicPr>
-                  <pic:cNvPr descr="pie de página" id="0" name="image2.png"/>
+                  <pic:cNvPr descr="pie de página" id="0" name="image1.png"/>
                   <pic:cNvPicPr preferRelativeResize="0"/>
                 </pic:nvPicPr>
                 <pic:blipFill>
@@ -3241,7 +3159,6 @@
 <w:hdr xmlns:mc="http://schemas.openxmlformats.org/markup-compatibility/2006" xmlns:o="urn:schemas-microsoft-com:office:office" xmlns:r="http://schemas.openxmlformats.org/officeDocument/2006/relationships" xmlns:m="http://schemas.openxmlformats.org/officeDocument/2006/math" xmlns:v="urn:schemas-microsoft-com:vml" xmlns:wp="http://schemas.openxmlformats.org/drawingml/2006/wordprocessingDrawing" xmlns:w10="urn:schemas-microsoft-com:office:word" xmlns:w="http://schemas.openxmlformats.org/wordprocessingml/2006/main" xmlns:wne="http://schemas.microsoft.com/office/word/2006/wordml" xmlns:sl="http://schemas.openxmlformats.org/schemaLibrary/2006/main" xmlns:a="http://schemas.openxmlformats.org/drawingml/2006/main" xmlns:pic="http://schemas.openxmlformats.org/drawingml/2006/picture" xmlns:c="http://schemas.openxmlformats.org/drawingml/2006/chart" xmlns:lc="http://schemas.openxmlformats.org/drawingml/2006/lockedCanvas" xmlns:dgm="http://schemas.openxmlformats.org/drawingml/2006/diagram" xmlns:wps="http://schemas.microsoft.com/office/word/2010/wordprocessingShape" xmlns:wpg="http://schemas.microsoft.com/office/word/2010/wordprocessingGroup" xmlns:w14="http://schemas.microsoft.com/office/word/2010/wordml" xmlns:w15="http://schemas.microsoft.com/office/word/2012/wordml" xmlns:w16="http://schemas.microsoft.com/office/word/2018/wordml" xmlns:w16cex="http://schemas.microsoft.com/office/word/2018/wordml/cex" xmlns:w16cid="http://schemas.microsoft.com/office/word/2016/wordml/cid" xmlns="http://schemas.microsoft.com/office/tasks/2019/documenttasks" xmlns:cr="http://schemas.microsoft.com/office/comments/2020/reactions">
   <w:p>
     <w:pPr>
-      <w:pageBreakBefore w:val="0"/>
       <w:pBdr>
         <w:top w:space="0" w:sz="0" w:val="nil"/>
         <w:left w:space="0" w:sz="0" w:val="nil"/>
@@ -3277,20 +3194,20 @@
         <wp:anchor allowOverlap="1" behindDoc="0" distB="0" distT="0" distL="0" distR="0" hidden="0" layoutInCell="1" locked="0" relativeHeight="0" simplePos="0">
           <wp:simplePos x="0" y="0"/>
           <wp:positionH relativeFrom="column">
-            <wp:posOffset>-914399</wp:posOffset>
+            <wp:posOffset>-914398</wp:posOffset>
           </wp:positionH>
           <wp:positionV relativeFrom="paragraph">
-            <wp:posOffset>-66674</wp:posOffset>
+            <wp:posOffset>-66673</wp:posOffset>
           </wp:positionV>
           <wp:extent cx="7781925" cy="95250"/>
           <wp:effectExtent b="0" l="0" r="0" t="0"/>
           <wp:wrapTopAndBottom distB="0" distT="0"/>
-          <wp:docPr descr="línea horizontal" id="2" name="image1.png"/>
+          <wp:docPr descr="línea horizontal" id="22" name="image3.png"/>
           <a:graphic>
             <a:graphicData uri="http://schemas.openxmlformats.org/drawingml/2006/picture">
               <pic:pic>
                 <pic:nvPicPr>
-                  <pic:cNvPr descr="línea horizontal" id="0" name="image1.png"/>
+                  <pic:cNvPr descr="línea horizontal" id="0" name="image3.png"/>
                   <pic:cNvPicPr preferRelativeResize="0"/>
                 </pic:nvPicPr>
                 <pic:blipFill>
@@ -3319,20 +3236,20 @@
         <wp:anchor allowOverlap="1" behindDoc="0" distB="0" distT="0" distL="0" distR="0" hidden="0" layoutInCell="1" locked="0" relativeHeight="0" simplePos="0">
           <wp:simplePos x="0" y="0"/>
           <wp:positionH relativeFrom="column">
-            <wp:posOffset>-919162</wp:posOffset>
+            <wp:posOffset>-919161</wp:posOffset>
           </wp:positionH>
           <wp:positionV relativeFrom="paragraph">
-            <wp:posOffset>-66674</wp:posOffset>
+            <wp:posOffset>-66673</wp:posOffset>
           </wp:positionV>
           <wp:extent cx="7781925" cy="95250"/>
           <wp:effectExtent b="0" l="0" r="0" t="0"/>
           <wp:wrapTopAndBottom distB="0" distT="0"/>
-          <wp:docPr descr="horizontal line" id="9" name="image2.png"/>
+          <wp:docPr descr="horizontal line" id="20" name="image1.png"/>
           <a:graphic>
             <a:graphicData uri="http://schemas.openxmlformats.org/drawingml/2006/picture">
               <pic:pic>
                 <pic:nvPicPr>
-                  <pic:cNvPr descr="horizontal line" id="0" name="image2.png"/>
+                  <pic:cNvPr descr="horizontal line" id="0" name="image1.png"/>
                   <pic:cNvPicPr preferRelativeResize="0"/>
                 </pic:nvPicPr>
                 <pic:blipFill>
@@ -3359,7 +3276,6 @@
   </w:p>
   <w:p>
     <w:pPr>
-      <w:pageBreakBefore w:val="0"/>
       <w:pBdr>
         <w:top w:space="0" w:sz="0" w:val="nil"/>
         <w:left w:space="0" w:sz="0" w:val="nil"/>
@@ -3387,12 +3303,12 @@
         <wp:inline distB="114300" distT="114300" distL="114300" distR="114300">
           <wp:extent cx="447675" cy="57150"/>
           <wp:effectExtent b="0" l="0" r="0" t="0"/>
-          <wp:docPr descr="línea corta" id="7" name="image3.png"/>
+          <wp:docPr descr="línea corta" id="21" name="image4.png"/>
           <a:graphic>
             <a:graphicData uri="http://schemas.openxmlformats.org/drawingml/2006/picture">
               <pic:pic>
                 <pic:nvPicPr>
-                  <pic:cNvPr descr="línea corta" id="0" name="image3.png"/>
+                  <pic:cNvPr descr="línea corta" id="0" name="image4.png"/>
                   <pic:cNvPicPr preferRelativeResize="0"/>
                 </pic:nvPicPr>
                 <pic:blipFill>
@@ -3435,7 +3351,7 @@
         <w:szCs w:val="16"/>
       </w:rPr>
     </w:pPr>
-    <w:bookmarkStart w:colFirst="0" w:colLast="0" w:name="_6nnchvexegiu" w:id="35"/>
+    <w:bookmarkStart w:colFirst="0" w:colLast="0" w:name="_heading=h.hl45ulen340z" w:id="35"/>
     <w:bookmarkEnd w:id="35"/>
     <w:r>
       <w:rPr>
@@ -3444,7 +3360,7 @@
     </w:r>
     <w:r>
       <w:drawing>
-        <wp:anchor allowOverlap="1" behindDoc="1" distB="114300" distT="114300" distL="114300" distR="114300" hidden="0" layoutInCell="1" locked="0" relativeHeight="0" simplePos="0">
+        <wp:anchor allowOverlap="1" behindDoc="1" distB="0" distT="0" distL="0" distR="0" hidden="0" layoutInCell="1" locked="0" relativeHeight="0" simplePos="0">
           <wp:simplePos x="0" y="0"/>
           <wp:positionH relativeFrom="column">
             <wp:posOffset>3248025</wp:posOffset>
@@ -3455,12 +3371,12 @@
           <wp:extent cx="3219450" cy="428625"/>
           <wp:effectExtent b="0" l="0" r="0" t="0"/>
           <wp:wrapNone/>
-          <wp:docPr id="10" name="image6.png"/>
+          <wp:docPr id="13" name="image2.png"/>
           <a:graphic>
             <a:graphicData uri="http://schemas.openxmlformats.org/drawingml/2006/picture">
               <pic:pic>
                 <pic:nvPicPr>
-                  <pic:cNvPr id="0" name="image6.png"/>
+                  <pic:cNvPr id="0" name="image2.png"/>
                   <pic:cNvPicPr preferRelativeResize="0"/>
                 </pic:nvPicPr>
                 <pic:blipFill>
@@ -3489,20 +3405,20 @@
         <wp:anchor allowOverlap="1" behindDoc="0" distB="0" distT="0" distL="0" distR="0" hidden="0" layoutInCell="1" locked="0" relativeHeight="0" simplePos="0">
           <wp:simplePos x="0" y="0"/>
           <wp:positionH relativeFrom="column">
-            <wp:posOffset>-919162</wp:posOffset>
+            <wp:posOffset>-919161</wp:posOffset>
           </wp:positionH>
           <wp:positionV relativeFrom="paragraph">
-            <wp:posOffset>-66674</wp:posOffset>
+            <wp:posOffset>-66673</wp:posOffset>
           </wp:positionV>
           <wp:extent cx="7781925" cy="95250"/>
           <wp:effectExtent b="0" l="0" r="0" t="0"/>
           <wp:wrapTopAndBottom distB="0" distT="0"/>
-          <wp:docPr descr="línea horizontal" id="6" name="image2.png"/>
+          <wp:docPr descr="línea horizontal" id="18" name="image1.png"/>
           <a:graphic>
             <a:graphicData uri="http://schemas.openxmlformats.org/drawingml/2006/picture">
               <pic:pic>
                 <pic:nvPicPr>
-                  <pic:cNvPr descr="línea horizontal" id="0" name="image2.png"/>
+                  <pic:cNvPr descr="línea horizontal" id="0" name="image1.png"/>
                   <pic:cNvPicPr preferRelativeResize="0"/>
                 </pic:nvPicPr>
                 <pic:blipFill>
@@ -4149,6 +4065,42 @@
       <w:szCs w:val="96"/>
     </w:rPr>
   </w:style>
+  <w:style w:type="table" w:styleId="TableNormal" w:default="1">
+    <w:name w:val="TableNormal"/>
+    <w:tblPr>
+      <w:tblCellMar>
+        <w:top w:w="100.0" w:type="dxa"/>
+        <w:left w:w="100.0" w:type="dxa"/>
+        <w:bottom w:w="100.0" w:type="dxa"/>
+        <w:right w:w="100.0" w:type="dxa"/>
+      </w:tblCellMar>
+    </w:tblPr>
+  </w:style>
+  <w:style w:type="paragraph" w:styleId="Normal" w:default="1">
+    <w:name w:val="normal"/>
+  </w:style>
+  <w:style w:type="table" w:styleId="Table1">
+    <w:basedOn w:val="TableNormal"/>
+    <w:tblPr>
+      <w:tblStyleRowBandSize w:val="1"/>
+      <w:tblStyleColBandSize w:val="1"/>
+    </w:tblPr>
+  </w:style>
+  <w:style w:type="table" w:styleId="Table2">
+    <w:basedOn w:val="TableNormal"/>
+    <w:tblPr>
+      <w:tblStyleRowBandSize w:val="1"/>
+      <w:tblStyleColBandSize w:val="1"/>
+    </w:tblPr>
+  </w:style>
+  <w:style w:type="table" w:styleId="Table3">
+    <w:basedOn w:val="TableNormal"/>
+    <w:tblPr>
+      <w:tblStyleRowBandSize w:val="1"/>
+      <w:tblStyleColBandSize w:val="1"/>
+      <w:tblCellMar/>
+    </w:tblPr>
+  </w:style>
   <w:style w:type="paragraph" w:styleId="Subtitle">
     <w:name w:val="Subtitle"/>
     <w:basedOn w:val="Normal"/>
@@ -4183,7 +4135,12 @@
     <w:tblPr>
       <w:tblStyleRowBandSize w:val="1"/>
       <w:tblStyleColBandSize w:val="1"/>
-      <w:tblCellMar/>
+      <w:tblCellMar>
+        <w:top w:w="100.0" w:type="dxa"/>
+        <w:left w:w="100.0" w:type="dxa"/>
+        <w:bottom w:w="100.0" w:type="dxa"/>
+        <w:right w:w="100.0" w:type="dxa"/>
+      </w:tblCellMar>
     </w:tblPr>
   </w:style>
 </w:styles>
@@ -4507,4 +4464,19 @@
   </a:objectDefaults>
   <a:extraClrSchemeLst/>
 </a:theme>
+</file>
+
+<file path=customXML/item1.xml><?xml version="1.0" encoding="utf-8"?>
+<go:gDocsCustomXmlDataStorage xmlns:go="http://customooxmlschemas.google.com/" xmlns:r="http://schemas.openxmlformats.org/officeDocument/2006/relationships" uri="GoogleDocsCustomDataVersion2">
+  <go:docsCustomData xmlns:go="http://customooxmlschemas.google.com/" roundtripDataSignature="AMtx7mgAKRJiW92F+xcQdJuvyCyOlCc3Rw==">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</go:docsCustomData>
+</go:gDocsCustomXmlDataStorage>
+</file>
+
+<file path=customXML/itemProps1.xml><?xml version="1.0" encoding="utf-8"?>
+<ds:datastoreItem xmlns:ds="http://schemas.openxmlformats.org/officeDocument/2006/customXml" ds:itemID="{11111111-1234-1234-1234-123412341234}">
+  <ds:schemaRefs>
+    <ds:schemaRef ds:uri="http://schemas.openxmlformats.org/officeDocument/2006/relationships"/>
+    <ds:schemaRef ds:uri="http://customooxmlschemas.google.com/"/>
+  </ds:schemaRefs>
+</ds:datastoreItem>
 </file>
</xml_diff>